<commit_message>
Add academic website link and clickable links in the CV download
- CV page shows a clickable contact line (email, Academic Website,
  LinkedIn, Google Scholar); link labels come from the CV's own wording
- The published .docx turns web addresses, emails and DOIs into real
  Word hyperlinks; addresses Word split across runs are left as text
- CV updated with the new site address

Co-Authored-By: Claude Opus 5.5 <noreply@anthropic.com>
</commit_message>
<xml_diff>
--- a/cv/cv.docx
+++ b/cv/cv.docx
@@ -6,19 +6,58 @@
       <w:pPr>
         <w:jc w:val="center"/>
         <w:rPr>
-          <w:rFonts w:ascii="Arial" w:hAnsi="Arial" w:cs="Arial"/>
-        </w:rPr>
-      </w:pPr>
-      <w:r>
-        <w:rPr>
           <w:rFonts w:ascii="Arial" w:hAnsi="Arial" w:eastAsia="Arial Black" w:cs="Arial"/>
           <w:b/>
           <w:bCs/>
           <w:color w:val="000000"/>
           <w:lang w:eastAsia="zh-CN" w:bidi="ar"/>
         </w:rPr>
+      </w:pPr>
+      <w:r>
+        <w:rPr>
+          <w:rFonts w:ascii="Arial" w:hAnsi="Arial" w:eastAsia="Arial Black" w:cs="Arial"/>
+          <w:b/>
+          <w:bCs/>
+          <w:color w:val="000000"/>
+          <w:lang w:eastAsia="zh-CN" w:bidi="ar"/>
+        </w:rPr>
         <w:t>Moses Oladele Ogunniran</w:t>
       </w:r>
+    </w:p>
+    <w:p>
+      <w:pPr>
+        <w:jc w:val="center"/>
+        <w:rPr>
+          <w:rFonts w:ascii="Arial" w:hAnsi="Arial" w:eastAsia="Arial Black" w:cs="Arial"/>
+          <w:b/>
+          <w:bCs/>
+          <w:color w:val="000000"/>
+          <w:lang w:eastAsia="zh-CN" w:bidi="ar"/>
+        </w:rPr>
+      </w:pPr>
+      <w:r>
+        <w:rPr>
+          <w:rFonts w:hint="default" w:ascii="Arial" w:hAnsi="Arial" w:eastAsia="SimSun" w:cs="Arial"/>
+          <w:b/>
+          <w:bCs/>
+          <w:sz w:val="24"/>
+          <w:szCs w:val="24"/>
+        </w:rPr>
+        <w:t>Academic Website</w:t>
+      </w:r>
+      <w:r>
+        <w:rPr>
+          <w:rFonts w:hint="default" w:ascii="Arial" w:hAnsi="Arial" w:eastAsia="SimSun" w:cs="Arial"/>
+          <w:b/>
+          <w:bCs/>
+          <w:sz w:val="24"/>
+          <w:szCs w:val="24"/>
+          <w:lang w:val="en-US"/>
+        </w:rPr>
+        <w:t>:https://mosesogunniran.github.io/</w:t>
+      </w:r>
+      <w:bookmarkStart w:id="0" w:name="_GoBack"/>
+      <w:bookmarkEnd w:id="0"/>
     </w:p>
     <w:p>
       <w:pPr>
@@ -8254,8 +8293,6 @@
         </w:rPr>
         <w:t>Fieldwork informed my M.Ed. thesis on Universal Basic Education policy and the provision of school facilities in Oyo State.</w:t>
       </w:r>
-      <w:bookmarkStart w:id="0" w:name="_GoBack"/>
-      <w:bookmarkEnd w:id="0"/>
     </w:p>
     <w:p>
       <w:pPr>

</xml_diff>

<commit_message>
Add AdDIE Lab graduate researcher role to Research Experience
Co-Authored-By: Claude Opus 5.5 <noreply@anthropic.com>
</commit_message>
<xml_diff>
--- a/cv/cv.docx
+++ b/cv/cv.docx
@@ -6,52 +6,58 @@
       <w:pPr>
         <w:jc w:val="center"/>
         <w:rPr>
-          <w:rFonts w:ascii="Arial" w:hAnsi="Arial" w:eastAsia="Arial Black" w:cs="Arial"/>
+          <w:rFonts w:hint="default" w:ascii="Arial" w:hAnsi="Arial" w:eastAsia="Arial Black" w:cs="Arial"/>
           <w:b/>
           <w:bCs/>
           <w:color w:val="000000"/>
-          <w:lang w:eastAsia="zh-CN" w:bidi="ar"/>
-        </w:rPr>
-      </w:pPr>
-      <w:r>
-        <w:rPr>
-          <w:rFonts w:ascii="Arial" w:hAnsi="Arial" w:eastAsia="Arial Black" w:cs="Arial"/>
-          <w:b/>
-          <w:bCs/>
-          <w:color w:val="000000"/>
-          <w:lang w:eastAsia="zh-CN" w:bidi="ar"/>
-        </w:rPr>
-        <w:t>Moses Oladele Ogunniran</w:t>
-      </w:r>
-    </w:p>
-    <w:p>
-      <w:pPr>
-        <w:jc w:val="center"/>
-        <w:rPr>
-          <w:rFonts w:ascii="Arial" w:hAnsi="Arial" w:eastAsia="Arial Black" w:cs="Arial"/>
-          <w:b/>
-          <w:bCs/>
-          <w:color w:val="000000"/>
-          <w:lang w:eastAsia="zh-CN" w:bidi="ar"/>
-        </w:rPr>
-      </w:pPr>
-      <w:r>
-        <w:rPr>
-          <w:rFonts w:hint="default" w:ascii="Arial" w:hAnsi="Arial" w:eastAsia="SimSun" w:cs="Arial"/>
-          <w:b/>
-          <w:bCs/>
           <w:sz w:val="24"/>
           <w:szCs w:val="24"/>
-        </w:rPr>
-        <w:t>Academic Website</w:t>
-      </w:r>
-      <w:r>
-        <w:rPr>
-          <w:rFonts w:hint="default" w:ascii="Arial" w:hAnsi="Arial" w:eastAsia="SimSun" w:cs="Arial"/>
-          <w:b/>
-          <w:bCs/>
+          <w:lang w:eastAsia="zh-CN" w:bidi="ar"/>
+        </w:rPr>
+      </w:pPr>
+      <w:r>
+        <w:rPr>
+          <w:rFonts w:hint="default" w:ascii="Arial" w:hAnsi="Arial" w:eastAsia="Arial Black" w:cs="Arial"/>
+          <w:b/>
+          <w:bCs/>
+          <w:color w:val="000000"/>
           <w:sz w:val="24"/>
           <w:szCs w:val="24"/>
+          <w:lang w:eastAsia="zh-CN" w:bidi="ar"/>
+        </w:rPr>
+        <w:t>Moses Oladele Ogunniran</w:t>
+      </w:r>
+    </w:p>
+    <w:p>
+      <w:pPr>
+        <w:jc w:val="center"/>
+        <w:rPr>
+          <w:rFonts w:hint="default" w:ascii="Arial" w:hAnsi="Arial" w:eastAsia="Arial Black" w:cs="Arial"/>
+          <w:b/>
+          <w:bCs/>
+          <w:color w:val="000000"/>
+          <w:sz w:val="24"/>
+          <w:szCs w:val="24"/>
+          <w:lang w:val="en-US" w:eastAsia="zh-CN" w:bidi="ar"/>
+        </w:rPr>
+      </w:pPr>
+      <w:r>
+        <w:rPr>
+          <w:rFonts w:hint="default" w:ascii="Arial" w:hAnsi="Arial" w:eastAsia="SimSun" w:cs="Arial"/>
+          <w:b/>
+          <w:bCs/>
+          <w:sz w:val="24"/>
+          <w:szCs w:val="24"/>
+        </w:rPr>
+        <w:t>Academic Website</w:t>
+      </w:r>
+      <w:r>
+        <w:rPr>
+          <w:rFonts w:hint="default" w:ascii="Arial" w:hAnsi="Arial" w:eastAsia="SimSun" w:cs="Arial"/>
+          <w:b/>
+          <w:bCs/>
+          <w:sz w:val="24"/>
+          <w:szCs w:val="24"/>
           <w:lang w:val="en-US"/>
         </w:rPr>
         <w:t>:https://mosesogunniran.github.io/</w:t>
@@ -73,25 +79,34 @@
       </w:pPr>
       <w:r>
         <w:rPr>
-          <w:rFonts w:ascii="Arial" w:hAnsi="Arial" w:eastAsia="Segoe UI" w:cs="Arial"/>
+          <w:rFonts w:hint="default" w:ascii="Arial" w:hAnsi="Arial" w:eastAsia="Segoe UI" w:cs="Arial"/>
           <w:sz w:val="18"/>
           <w:szCs w:val="18"/>
         </w:rPr>
         <w:t xml:space="preserve">LinkedIn: </w:t>
       </w:r>
       <w:r>
+        <w:rPr>
+          <w:rFonts w:hint="default" w:ascii="Arial" w:hAnsi="Arial" w:cs="Arial"/>
+        </w:rPr>
         <w:fldChar w:fldCharType="begin"/>
       </w:r>
       <w:r>
+        <w:rPr>
+          <w:rFonts w:hint="default" w:ascii="Arial" w:hAnsi="Arial" w:cs="Arial"/>
+        </w:rPr>
         <w:instrText xml:space="preserve"> HYPERLINK "http://www.linkedin.com/in/moses-ogunniran-ba7428135" \h </w:instrText>
       </w:r>
       <w:r>
+        <w:rPr>
+          <w:rFonts w:hint="default" w:ascii="Arial" w:hAnsi="Arial" w:cs="Arial"/>
+        </w:rPr>
         <w:fldChar w:fldCharType="separate"/>
       </w:r>
       <w:r>
         <w:rPr>
           <w:rStyle w:val="10"/>
-          <w:rFonts w:ascii="Arial" w:hAnsi="Arial" w:eastAsia="Segoe UI" w:cs="Arial"/>
+          <w:rFonts w:hint="default" w:ascii="Arial" w:hAnsi="Arial" w:eastAsia="Segoe UI" w:cs="Arial"/>
           <w:sz w:val="18"/>
           <w:szCs w:val="18"/>
         </w:rPr>
@@ -100,7 +115,7 @@
       <w:r>
         <w:rPr>
           <w:rStyle w:val="14"/>
-          <w:rFonts w:ascii="Arial" w:hAnsi="Arial" w:eastAsia="Segoe UI" w:cs="Arial"/>
+          <w:rFonts w:hint="default" w:ascii="Arial" w:hAnsi="Arial" w:eastAsia="Segoe UI" w:cs="Arial"/>
           <w:sz w:val="18"/>
           <w:szCs w:val="18"/>
         </w:rPr>
@@ -108,7 +123,7 @@
       </w:r>
       <w:r>
         <w:rPr>
-          <w:rFonts w:ascii="Arial" w:hAnsi="Arial" w:cs="Arial"/>
+          <w:rFonts w:hint="default" w:ascii="Arial" w:hAnsi="Arial" w:cs="Arial"/>
           <w:color w:val="000000" w:themeColor="text1" w:themeTint="FF"/>
           <w:sz w:val="18"/>
           <w:szCs w:val="18"/>
@@ -125,7 +140,7 @@
       </w:r>
       <w:r>
         <w:rPr>
-          <w:rFonts w:ascii="Arial" w:hAnsi="Arial" w:eastAsia="SimSun" w:cs="Arial"/>
+          <w:rFonts w:hint="default" w:ascii="Arial" w:hAnsi="Arial" w:eastAsia="SimSun" w:cs="Arial"/>
           <w:color w:val="000000" w:themeColor="text1" w:themeTint="FF"/>
           <w:sz w:val="18"/>
           <w:szCs w:val="18"/>
@@ -142,18 +157,27 @@
         <w:t xml:space="preserve">Email: </w:t>
       </w:r>
       <w:r>
+        <w:rPr>
+          <w:rFonts w:hint="default" w:ascii="Arial" w:hAnsi="Arial" w:cs="Arial"/>
+        </w:rPr>
         <w:fldChar w:fldCharType="begin"/>
       </w:r>
       <w:r>
+        <w:rPr>
+          <w:rFonts w:hint="default" w:ascii="Arial" w:hAnsi="Arial" w:cs="Arial"/>
+        </w:rPr>
         <w:instrText xml:space="preserve"> HYPERLINK "http://moogunniran@crimson.ua.edu" \h </w:instrText>
       </w:r>
       <w:r>
+        <w:rPr>
+          <w:rFonts w:hint="default" w:ascii="Arial" w:hAnsi="Arial" w:cs="Arial"/>
+        </w:rPr>
         <w:fldChar w:fldCharType="separate"/>
       </w:r>
       <w:r>
         <w:rPr>
           <w:rStyle w:val="14"/>
-          <w:rFonts w:ascii="Arial" w:hAnsi="Arial" w:eastAsia="SimSun" w:cs="Arial"/>
+          <w:rFonts w:hint="default" w:ascii="Arial" w:hAnsi="Arial" w:eastAsia="SimSun" w:cs="Arial"/>
           <w:sz w:val="18"/>
           <w:szCs w:val="18"/>
           <w:lang w:eastAsia="zh-CN" w:bidi="ar"/>
@@ -163,7 +187,7 @@
       <w:r>
         <w:rPr>
           <w:rStyle w:val="14"/>
-          <w:rFonts w:ascii="Arial" w:hAnsi="Arial" w:eastAsia="SimSun" w:cs="Arial"/>
+          <w:rFonts w:hint="default" w:ascii="Arial" w:hAnsi="Arial" w:eastAsia="SimSun" w:cs="Arial"/>
           <w:sz w:val="18"/>
           <w:szCs w:val="18"/>
           <w:lang w:eastAsia="zh-CN" w:bidi="ar"/>
@@ -173,7 +197,7 @@
       <w:r>
         <w:rPr>
           <w:rStyle w:val="14"/>
-          <w:rFonts w:ascii="Arial" w:hAnsi="Arial" w:eastAsia="SimSun" w:cs="Arial"/>
+          <w:rFonts w:hint="default" w:ascii="Arial" w:hAnsi="Arial" w:eastAsia="SimSun" w:cs="Arial"/>
           <w:sz w:val="18"/>
           <w:szCs w:val="18"/>
           <w:lang w:eastAsia="zh-CN" w:bidi="ar"/>
@@ -4065,6 +4089,274 @@
           <w:lang w:val="en-US"/>
         </w:rPr>
         <w:t>.</w:t>
+      </w:r>
+    </w:p>
+    <w:p>
+      <w:pPr>
+        <w:ind w:right="-720" w:hanging="630"/>
+        <w:jc w:val="both"/>
+        <w:rPr>
+          <w:rFonts w:ascii="Arial" w:hAnsi="Arial" w:cs="Arial"/>
+          <w:b/>
+          <w:bCs/>
+          <w:sz w:val="18"/>
+          <w:szCs w:val="18"/>
+        </w:rPr>
+      </w:pPr>
+    </w:p>
+    <w:p>
+      <w:pPr>
+        <w:ind w:left="-630" w:right="-720"/>
+        <w:jc w:val="both"/>
+        <w:rPr>
+          <w:rFonts w:ascii="Arial" w:hAnsi="Arial" w:eastAsia="SimSun" w:cs="Arial"/>
+          <w:color w:val="000000"/>
+          <w:sz w:val="18"/>
+          <w:szCs w:val="18"/>
+          <w:lang w:eastAsia="zh-CN" w:bidi="ar"/>
+        </w:rPr>
+      </w:pPr>
+      <w:r>
+        <w:rPr>
+          <w:rFonts w:ascii="Arial" w:hAnsi="Arial" w:eastAsia="TimesNewRomanPS-ItalicMT" w:cs="Arial"/>
+          <w:b/>
+          <w:bCs/>
+          <w:color w:val="000000" w:themeColor="text1" w:themeTint="FF"/>
+          <w:sz w:val="18"/>
+          <w:szCs w:val="18"/>
+          <w:lang w:eastAsia="zh-CN" w:bidi="ar"/>
+          <w14:textFill>
+            <w14:solidFill>
+              <w14:schemeClr w14:val="tx1">
+                <w14:lumMod w14:val="100000"/>
+                <w14:lumOff w14:val="0"/>
+              </w14:schemeClr>
+            </w14:solidFill>
+          </w14:textFill>
+        </w:rPr>
+        <w:t xml:space="preserve">University of Alabama, AdDIE Lab, Tuscaloosa, United States: Graduate Researcher.</w:t>
+      </w:r>
+      <w:r>
+        <w:rPr>
+          <w:rFonts w:ascii="Arial" w:hAnsi="Arial" w:eastAsia="TimesNewRomanPS-ItalicMT" w:cs="Arial"/>
+          <w:b/>
+          <w:bCs/>
+          <w:color w:val="000000" w:themeColor="text1" w:themeTint="FF"/>
+          <w:sz w:val="18"/>
+          <w:szCs w:val="18"/>
+          <w:lang w:eastAsia="zh-CN" w:bidi="ar"/>
+          <w14:textFill>
+            <w14:solidFill>
+              <w14:schemeClr w14:val="tx1">
+                <w14:lumMod w14:val="100000"/>
+                <w14:lumOff w14:val="0"/>
+              </w14:schemeClr>
+            </w14:solidFill>
+          </w14:textFill>
+        </w:rPr>
+        <w:tab/>
+      </w:r>
+      <w:r>
+        <w:rPr>
+          <w:rFonts w:ascii="Arial" w:hAnsi="Arial" w:eastAsia="TimesNewRomanPS-ItalicMT" w:cs="Arial"/>
+          <w:b/>
+          <w:bCs/>
+          <w:color w:val="000000" w:themeColor="text1" w:themeTint="FF"/>
+          <w:sz w:val="18"/>
+          <w:szCs w:val="18"/>
+          <w:lang w:eastAsia="zh-CN" w:bidi="ar"/>
+          <w14:textFill>
+            <w14:solidFill>
+              <w14:schemeClr w14:val="tx1">
+                <w14:lumMod w14:val="100000"/>
+                <w14:lumOff w14:val="0"/>
+              </w14:schemeClr>
+            </w14:solidFill>
+          </w14:textFill>
+        </w:rPr>
+        <w:t xml:space="preserve"> 2024–Present</w:t>
+      </w:r>
+      <w:r>
+        <w:rPr>
+          <w:rFonts w:ascii="Arial" w:hAnsi="Arial" w:eastAsia="TimesNewRomanPS-ItalicMT" w:cs="Arial"/>
+          <w:b/>
+          <w:color w:val="000000" w:themeColor="text1" w:themeTint="FF"/>
+          <w:sz w:val="18"/>
+          <w:szCs w:val="18"/>
+          <w:lang w:eastAsia="zh-CN" w:bidi="ar"/>
+          <w14:textFill>
+            <w14:solidFill>
+              <w14:schemeClr w14:val="tx1">
+                <w14:lumMod w14:val="100000"/>
+                <w14:lumOff w14:val="0"/>
+              </w14:schemeClr>
+            </w14:solidFill>
+          </w14:textFill>
+        </w:rPr>
+        <w:br/>
+      </w:r>
+      <w:r>
+        <w:rPr>
+          <w:rFonts w:ascii="Arial" w:hAnsi="Arial" w:eastAsia="TimesNewRomanPS-ItalicMT" w:cs="Arial"/>
+          <w:b/>
+          <w:color w:val="000000" w:themeColor="text1" w:themeTint="FF"/>
+          <w:sz w:val="18"/>
+          <w:szCs w:val="18"/>
+          <w:lang w:eastAsia="zh-CN" w:bidi="ar"/>
+          <w14:textFill>
+            <w14:solidFill>
+              <w14:schemeClr w14:val="tx1">
+                <w14:lumMod w14:val="100000"/>
+                <w14:lumOff w14:val="0"/>
+              </w14:schemeClr>
+            </w14:solidFill>
+          </w14:textFill>
+        </w:rPr>
+        <w:t xml:space="preserve">Adaptive Design of Immersive E-Learning (AdDIE) Lab | Lab Director: Dr. Jewoong Moon</w:t>
+      </w:r>
+    </w:p>
+    <w:p>
+      <w:pPr>
+        <w:pStyle w:val="19"/>
+        <w:numPr>
+          <w:ilvl w:val="0"/>
+          <w:numId w:val="1"/>
+        </w:numPr>
+        <w:ind w:left="-540" w:firstLine="0"/>
+        <w:jc w:val="both"/>
+        <w:rPr>
+          <w:rFonts w:ascii="Arial" w:hAnsi="Arial" w:eastAsia="SimSun" w:cs="Arial"/>
+          <w:color w:val="000000"/>
+          <w:sz w:val="18"/>
+          <w:szCs w:val="18"/>
+          <w:lang w:eastAsia="zh-CN" w:bidi="ar"/>
+        </w:rPr>
+      </w:pPr>
+      <w:r>
+        <w:rPr>
+          <w:rFonts w:ascii="Arial" w:hAnsi="Arial" w:eastAsia="SimSun" w:cs="Arial"/>
+          <w:color w:val="000000" w:themeColor="text1" w:themeTint="FF"/>
+          <w:sz w:val="18"/>
+          <w:szCs w:val="18"/>
+          <w:lang w:eastAsia="zh-CN" w:bidi="ar"/>
+          <w14:textFill>
+            <w14:solidFill>
+              <w14:schemeClr w14:val="tx1">
+                <w14:lumMod w14:val="100000"/>
+                <w14:lumOff w14:val="0"/>
+              </w14:schemeClr>
+            </w14:solidFill>
+          </w14:textFill>
+        </w:rPr>
+        <w:t xml:space="preserve">Investigate the application of learning experience design (LXD), human–computer interaction (HCI) principles, and multimedia instructional tools to address gaps between graduate training and labor-market demands.</w:t>
+      </w:r>
+    </w:p>
+    <w:p>
+      <w:pPr>
+        <w:pStyle w:val="19"/>
+        <w:numPr>
+          <w:ilvl w:val="0"/>
+          <w:numId w:val="1"/>
+        </w:numPr>
+        <w:ind w:left="-540" w:firstLine="0"/>
+        <w:jc w:val="both"/>
+        <w:rPr>
+          <w:rFonts w:ascii="Arial" w:hAnsi="Arial" w:eastAsia="SimSun" w:cs="Arial"/>
+          <w:color w:val="000000"/>
+          <w:sz w:val="18"/>
+          <w:szCs w:val="18"/>
+          <w:lang w:eastAsia="zh-CN" w:bidi="ar"/>
+        </w:rPr>
+      </w:pPr>
+      <w:r>
+        <w:rPr>
+          <w:rFonts w:ascii="Arial" w:hAnsi="Arial" w:eastAsia="SimSun" w:cs="Arial"/>
+          <w:color w:val="000000" w:themeColor="text1" w:themeTint="FF"/>
+          <w:sz w:val="18"/>
+          <w:szCs w:val="18"/>
+          <w:lang w:eastAsia="zh-CN" w:bidi="ar"/>
+          <w14:textFill>
+            <w14:solidFill>
+              <w14:schemeClr w14:val="tx1">
+                <w14:lumMod w14:val="100000"/>
+                <w14:lumOff w14:val="0"/>
+              </w14:schemeClr>
+            </w14:solidFill>
+          </w14:textFill>
+        </w:rPr>
+        <w:t xml:space="preserve">Develop a proposed microlearning platform tailored to the career development needs of underprepared and underrepresented graduate students.</w:t>
+      </w:r>
+    </w:p>
+    <w:p>
+      <w:pPr>
+        <w:pStyle w:val="19"/>
+        <w:numPr>
+          <w:ilvl w:val="0"/>
+          <w:numId w:val="1"/>
+        </w:numPr>
+        <w:ind w:left="-540" w:firstLine="0"/>
+        <w:jc w:val="both"/>
+        <w:rPr>
+          <w:rFonts w:ascii="Arial" w:hAnsi="Arial" w:eastAsia="SimSun" w:cs="Arial"/>
+          <w:color w:val="000000"/>
+          <w:sz w:val="18"/>
+          <w:szCs w:val="18"/>
+          <w:lang w:eastAsia="zh-CN" w:bidi="ar"/>
+        </w:rPr>
+      </w:pPr>
+      <w:r>
+        <w:rPr>
+          <w:rFonts w:ascii="Arial" w:hAnsi="Arial" w:eastAsia="SimSun" w:cs="Arial"/>
+          <w:color w:val="000000" w:themeColor="text1" w:themeTint="FF"/>
+          <w:sz w:val="18"/>
+          <w:szCs w:val="18"/>
+          <w:lang w:eastAsia="zh-CN" w:bidi="ar"/>
+          <w14:textFill>
+            <w14:solidFill>
+              <w14:schemeClr w14:val="tx1">
+                <w14:lumMod w14:val="100000"/>
+                <w14:lumOff w14:val="0"/>
+              </w14:schemeClr>
+            </w14:solidFill>
+          </w14:textFill>
+        </w:rPr>
+        <w:t xml:space="preserve">Explore generative AI–informed instructional design strategies to foster soft skills, career readiness, and graduate employability.</w:t>
+      </w:r>
+    </w:p>
+    <w:p>
+      <w:pPr>
+        <w:pStyle w:val="19"/>
+        <w:numPr>
+          <w:ilvl w:val="0"/>
+          <w:numId w:val="1"/>
+        </w:numPr>
+        <w:ind w:left="-540" w:firstLine="0"/>
+        <w:jc w:val="both"/>
+        <w:rPr>
+          <w:rFonts w:ascii="Arial" w:hAnsi="Arial" w:eastAsia="SimSun" w:cs="Arial"/>
+          <w:color w:val="000000"/>
+          <w:sz w:val="18"/>
+          <w:szCs w:val="18"/>
+          <w:lang w:eastAsia="zh-CN" w:bidi="ar"/>
+        </w:rPr>
+      </w:pPr>
+      <w:r>
+        <w:rPr>
+          <w:rFonts w:ascii="Arial" w:hAnsi="Arial" w:eastAsia="SimSun" w:cs="Arial"/>
+          <w:color w:val="000000" w:themeColor="text1" w:themeTint="FF"/>
+          <w:sz w:val="18"/>
+          <w:szCs w:val="18"/>
+          <w:lang w:eastAsia="zh-CN" w:bidi="ar"/>
+          <w14:textFill>
+            <w14:solidFill>
+              <w14:schemeClr w14:val="tx1">
+                <w14:lumMod w14:val="100000"/>
+                <w14:lumOff w14:val="0"/>
+              </w14:schemeClr>
+            </w14:solidFill>
+          </w14:textFill>
+        </w:rPr>
+        <w:t xml:space="preserve">Examine usability, accessibility, and learning analytics as design principles for adaptive, student-centered digital learning environments.</w:t>
       </w:r>
     </w:p>
     <w:p>

</xml_diff>

<commit_message>
Add CESA 2018 Siem Reap presentation and CESA membership
Co-Authored-By: Claude Opus 5.5 <noreply@anthropic.com>
</commit_message>
<xml_diff>
--- a/cv/cv.docx
+++ b/cv/cv.docx
@@ -30204,6 +30204,67 @@
         </w:numPr>
         <w:ind w:left="-270"/>
         <w:rPr>
+          <w:rFonts w:hint="default" w:ascii="Arial" w:hAnsi="Arial" w:cs="Arial"/>
+          <w:b/>
+          <w:bCs/>
+          <w:sz w:val="18"/>
+          <w:szCs w:val="18"/>
+        </w:rPr>
+      </w:pPr>
+      <w:r>
+        <w:rPr>
+          <w:rFonts w:hint="default" w:ascii="Arial" w:hAnsi="Arial" w:cs="Arial"/>
+          <w:b/>
+          <w:bCs/>
+          <w:sz w:val="18"/>
+          <w:szCs w:val="18"/>
+          <w:lang w:val="en-US"/>
+        </w:rPr>
+        <w:t xml:space="preserve">Member of the Comparative Education Society of Asia (CESA) </w:t>
+      </w:r>
+      <w:r>
+        <w:rPr>
+          <w:rFonts w:hint="default" w:ascii="Arial" w:hAnsi="Arial" w:cs="Arial"/>
+          <w:b/>
+          <w:bCs/>
+          <w:sz w:val="18"/>
+          <w:szCs w:val="18"/>
+          <w:lang w:val="en-US"/>
+        </w:rPr>
+        <w:tab/>
+      </w:r>
+      <w:r>
+        <w:rPr>
+          <w:rFonts w:hint="default" w:ascii="Arial" w:hAnsi="Arial" w:cs="Arial"/>
+          <w:b/>
+          <w:bCs/>
+          <w:sz w:val="18"/>
+          <w:szCs w:val="18"/>
+          <w:lang w:val="en-US"/>
+        </w:rPr>
+        <w:tab/>
+      </w:r>
+      <w:r>
+        <w:rPr>
+          <w:rFonts w:hint="default" w:ascii="Arial" w:hAnsi="Arial" w:cs="Arial"/>
+          <w:b/>
+          <w:bCs/>
+          <w:sz w:val="18"/>
+          <w:szCs w:val="18"/>
+          <w:lang w:val="en-US"/>
+        </w:rPr>
+        <w:t xml:space="preserve">                  2018 - present</w:t>
+      </w:r>
+    </w:p>
+    <w:p>
+      <w:pPr>
+        <w:pStyle w:val="12"/>
+        <w:numPr>
+          <w:ilvl w:val="0"/>
+          <w:numId w:val="14"/>
+        </w:numPr>
+        <w:ind w:left="-270"/>
+        <w:rPr>
           <w:rFonts w:ascii="Arial" w:hAnsi="Arial" w:cs="Arial"/>
         </w:rPr>
       </w:pPr>
@@ -32490,6 +32551,104 @@
           <w:lang w:val="en-US"/>
         </w:rPr>
         <w:t>.</w:t>
+      </w:r>
+    </w:p>
+    <w:p>
+      <w:pPr>
+        <w:pStyle w:val="19"/>
+        <w:numPr>
+          <w:ilvl w:val="0"/>
+          <w:numId w:val="14"/>
+        </w:numPr>
+        <w:ind w:left="-270"/>
+        <w:jc w:val="both"/>
+        <w:rPr>
+          <w:rFonts w:hint="default" w:ascii="Arial" w:hAnsi="Arial" w:cs="Arial"/>
+          <w:sz w:val="18"/>
+          <w:szCs w:val="18"/>
+        </w:rPr>
+      </w:pPr>
+      <w:r>
+        <w:rPr>
+          <w:rFonts w:hint="default" w:ascii="Arial" w:hAnsi="Arial" w:cs="Arial"/>
+          <w:sz w:val="18"/>
+          <w:szCs w:val="18"/>
+        </w:rPr>
+        <w:t xml:space="preserve">11th Biennial Conference of the Comparative Education Society of Asia (CESA), Sokhalay Angkor Resort, Siem Reap, Cambodia, </w:t>
+      </w:r>
+      <w:r>
+        <w:rPr>
+          <w:rFonts w:hint="default" w:ascii="Arial" w:hAnsi="Arial" w:cs="Arial"/>
+          <w:b/>
+          <w:bCs/>
+          <w:sz w:val="18"/>
+          <w:szCs w:val="18"/>
+        </w:rPr>
+        <w:t xml:space="preserve">May 11–12, 2018</w:t>
+      </w:r>
+      <w:r>
+        <w:rPr>
+          <w:rFonts w:hint="default" w:ascii="Arial" w:hAnsi="Arial" w:cs="Arial"/>
+          <w:sz w:val="18"/>
+          <w:szCs w:val="18"/>
+        </w:rPr>
+        <w:t xml:space="preserve"> (Parallel Session 2-C: Multi-Stakeholder Engagement in School Governance)</w:t>
+      </w:r>
+      <w:r>
+        <w:rPr>
+          <w:rFonts w:hint="default" w:ascii="Arial" w:hAnsi="Arial" w:cs="Arial"/>
+          <w:b/>
+          <w:bCs/>
+          <w:sz w:val="18"/>
+          <w:szCs w:val="18"/>
+        </w:rPr>
+        <w:t xml:space="preserve">.</w:t>
+      </w:r>
+      <w:r>
+        <w:rPr>
+          <w:rFonts w:hint="default" w:ascii="Arial" w:hAnsi="Arial" w:cs="Arial"/>
+          <w:b/>
+          <w:bCs/>
+          <w:sz w:val="18"/>
+          <w:szCs w:val="18"/>
+        </w:rPr>
+        <w:br w:type="textWrapping"/>
+      </w:r>
+      <w:r>
+        <w:rPr>
+          <w:rFonts w:hint="default" w:ascii="Arial" w:hAnsi="Arial" w:cs="Arial"/>
+          <w:b/>
+          <w:bCs/>
+          <w:sz w:val="18"/>
+          <w:szCs w:val="18"/>
+        </w:rPr>
+        <w:t xml:space="preserve">Presented topic: </w:t>
+      </w:r>
+      <w:r>
+        <w:rPr>
+          <w:rFonts w:hint="default" w:ascii="Arial" w:hAnsi="Arial" w:cs="Arial"/>
+          <w:sz w:val="18"/>
+          <w:szCs w:val="18"/>
+        </w:rPr>
+        <w:t xml:space="preserve">"The Role of UBE Programme in the Provision of School Facilities in Ibadan South-West Local Government Area, Oyo State, Nigeria" by</w:t>
+      </w:r>
+      <w:r>
+        <w:rPr>
+          <w:rFonts w:hint="default" w:ascii="Arial" w:hAnsi="Arial" w:cs="Arial"/>
+          <w:b/>
+          <w:bCs/>
+          <w:sz w:val="18"/>
+          <w:szCs w:val="18"/>
+        </w:rPr>
+        <w:t xml:space="preserve"> Ogunniran, M. O</w:t>
+      </w:r>
+      <w:r>
+        <w:rPr>
+          <w:rFonts w:hint="default" w:ascii="Arial" w:hAnsi="Arial" w:cs="Arial"/>
+          <w:sz w:val="18"/>
+          <w:szCs w:val="18"/>
+        </w:rPr>
+        <w:t xml:space="preserve">.</w:t>
       </w:r>
     </w:p>
     <w:p>

</xml_diff>

<commit_message>
About page: portrait in the header, BNU doctoral colleagues photo
Adds the headshot beside the About heading and a photo with fellow
doctoral scholars at Beijing Normal University under Education.

Co-Authored-By: Claude Opus 5.5 <noreply@anthropic.com>
</commit_message>
<xml_diff>
--- a/cv/cv.docx
+++ b/cv/cv.docx
@@ -62,8 +62,6 @@
         </w:rPr>
         <w:t>:https://mosesogunniran.github.io/</w:t>
       </w:r>
-      <w:bookmarkStart w:id="0" w:name="_GoBack"/>
-      <w:bookmarkEnd w:id="0"/>
     </w:p>
     <w:p>
       <w:pPr>
@@ -4134,7 +4132,7 @@
             </w14:solidFill>
           </w14:textFill>
         </w:rPr>
-        <w:t xml:space="preserve">University of Alabama, AdDIE Lab, Tuscaloosa, United States: Graduate Researcher.</w:t>
+        <w:t>University of Alabama, AdDIE Lab, Tuscaloosa, United States: Graduate Researcher.</w:t>
       </w:r>
       <w:r>
         <w:rPr>
@@ -4158,6 +4156,49 @@
       </w:r>
       <w:r>
         <w:rPr>
+          <w:rFonts w:hint="default" w:ascii="Arial" w:hAnsi="Arial" w:eastAsia="TimesNewRomanPS-ItalicMT" w:cs="Arial"/>
+          <w:b/>
+          <w:bCs/>
+          <w:color w:val="000000" w:themeColor="text1" w:themeTint="FF"/>
+          <w:sz w:val="18"/>
+          <w:szCs w:val="18"/>
+          <w:lang w:val="en-US" w:eastAsia="zh-CN" w:bidi="ar"/>
+          <w14:textFill>
+            <w14:solidFill>
+              <w14:schemeClr w14:val="tx1">
+                <w14:lumMod w14:val="100000"/>
+                <w14:lumOff w14:val="0"/>
+              </w14:schemeClr>
+            </w14:solidFill>
+          </w14:textFill>
+        </w:rPr>
+        <w:tab/>
+        <w:t/>
+      </w:r>
+      <w:r>
+        <w:rPr>
+          <w:rFonts w:hint="default" w:ascii="Arial" w:hAnsi="Arial" w:eastAsia="TimesNewRomanPS-ItalicMT" w:cs="Arial"/>
+          <w:b/>
+          <w:bCs/>
+          <w:color w:val="000000" w:themeColor="text1" w:themeTint="FF"/>
+          <w:sz w:val="18"/>
+          <w:szCs w:val="18"/>
+          <w:lang w:val="en-US" w:eastAsia="zh-CN" w:bidi="ar"/>
+          <w14:textFill>
+            <w14:solidFill>
+              <w14:schemeClr w14:val="tx1">
+                <w14:lumMod w14:val="100000"/>
+                <w14:lumOff w14:val="0"/>
+              </w14:schemeClr>
+            </w14:solidFill>
+          </w14:textFill>
+        </w:rPr>
+        <w:tab/>
+      </w:r>
+      <w:bookmarkStart w:id="0" w:name="_GoBack"/>
+      <w:bookmarkEnd w:id="0"/>
+      <w:r>
+        <w:rPr>
           <w:rFonts w:ascii="Arial" w:hAnsi="Arial" w:eastAsia="TimesNewRomanPS-ItalicMT" w:cs="Arial"/>
           <w:b/>
           <w:bCs/>
@@ -4193,7 +4234,7 @@
             </w14:solidFill>
           </w14:textFill>
         </w:rPr>
-        <w:br/>
+        <w:br w:type="textWrapping"/>
       </w:r>
       <w:r>
         <w:rPr>
@@ -4212,7 +4253,7 @@
             </w14:solidFill>
           </w14:textFill>
         </w:rPr>
-        <w:t xml:space="preserve">Adaptive Design of Immersive E-Learning (AdDIE) Lab | Lab Director: Dr. Jewoong Moon</w:t>
+        <w:t>Adaptive Design of Immersive E-Learning (AdDIE) Lab | Lab Director: Dr. Jewoong Moon</w:t>
       </w:r>
     </w:p>
     <w:p>
@@ -4248,7 +4289,7 @@
             </w14:solidFill>
           </w14:textFill>
         </w:rPr>
-        <w:t xml:space="preserve">Investigate the application of learning experience design (LXD), human–computer interaction (HCI) principles, and multimedia instructional tools to address gaps between graduate training and labor-market demands.</w:t>
+        <w:t>Investigate the application of learning experience design (LXD), human–computer interaction (HCI) principles, and multimedia instructional tools to address gaps between graduate training and labor-market demands.</w:t>
       </w:r>
     </w:p>
     <w:p>
@@ -4284,7 +4325,7 @@
             </w14:solidFill>
           </w14:textFill>
         </w:rPr>
-        <w:t xml:space="preserve">Develop a proposed microlearning platform tailored to the career development needs of underprepared and underrepresented graduate students.</w:t>
+        <w:t>Develop a proposed microlearning platform tailored to the career development needs of underprepared and underrepresented graduate students.</w:t>
       </w:r>
     </w:p>
     <w:p>
@@ -4320,7 +4361,7 @@
             </w14:solidFill>
           </w14:textFill>
         </w:rPr>
-        <w:t xml:space="preserve">Explore generative AI–informed instructional design strategies to foster soft skills, career readiness, and graduate employability.</w:t>
+        <w:t>Explore generative AI–informed instructional design strategies to foster soft skills, career readiness, and graduate employability.</w:t>
       </w:r>
     </w:p>
     <w:p>
@@ -4356,7 +4397,7 @@
             </w14:solidFill>
           </w14:textFill>
         </w:rPr>
-        <w:t xml:space="preserve">Examine usability, accessibility, and learning analytics as design principles for adaptive, student-centered digital learning environments.</w:t>
+        <w:t>Examine usability, accessibility, and learning analytics as design principles for adaptive, student-centered digital learning environments.</w:t>
       </w:r>
     </w:p>
     <w:p>
@@ -32584,7 +32625,7 @@
           <w:sz w:val="18"/>
           <w:szCs w:val="18"/>
         </w:rPr>
-        <w:t xml:space="preserve">May 11–12, 2018</w:t>
+        <w:t>May 11–12, 2018</w:t>
       </w:r>
       <w:r>
         <w:rPr>
@@ -32602,7 +32643,7 @@
           <w:sz w:val="18"/>
           <w:szCs w:val="18"/>
         </w:rPr>
-        <w:t xml:space="preserve">.</w:t>
+        <w:t>.</w:t>
       </w:r>
       <w:r>
         <w:rPr>
@@ -32630,7 +32671,7 @@
           <w:sz w:val="18"/>
           <w:szCs w:val="18"/>
         </w:rPr>
-        <w:t xml:space="preserve">"The Role of UBE Programme in the Provision of School Facilities in Ibadan South-West Local Government Area, Oyo State, Nigeria" by</w:t>
+        <w:t>"The Role of UBE Programme in the Provision of School Facilities in Ibadan South-West Local Government Area, Oyo State, Nigeria" by</w:t>
       </w:r>
       <w:r>
         <w:rPr>
@@ -32648,7 +32689,7 @@
           <w:sz w:val="18"/>
           <w:szCs w:val="18"/>
         </w:rPr>
-        <w:t xml:space="preserve">.</w:t>
+        <w:t>.</w:t>
       </w:r>
     </w:p>
     <w:p>

</xml_diff>